<commit_message>
Added ID and date fields for AI usage register
</commit_message>
<xml_diff>
--- a/assignment/SEN381 Assignment 3.docx
+++ b/assignment/SEN381 Assignment 3.docx
@@ -10,6 +10,7 @@
           <w:docPartUnique/>
         </w:docPartObj>
       </w:sdtPr>
+      <w:sdtEndPr/>
       <w:sdtContent>
         <w:p>
           <w:r>
@@ -87,6 +88,7 @@
                                   <w:dataBinding w:prefixMappings="xmlns:ns0='http://schemas.openxmlformats.org/package/2006/metadata/core-properties' xmlns:ns1='http://purl.org/dc/elements/1.1/'" w:xpath="/ns0:coreProperties[1]/ns1:title[1]" w:storeItemID="{6C3C8BC8-F283-45AE-878A-BAB7291924A1}"/>
                                   <w:text/>
                                 </w:sdtPr>
+                                <w:sdtEndPr/>
                                 <w:sdtContent>
                                   <w:p>
                                     <w:pPr>
@@ -141,6 +143,7 @@
                                   <w:dataBinding w:prefixMappings="xmlns:ns0='http://schemas.microsoft.com/office/2006/coverPageProps'" w:xpath="/ns0:CoverPageProperties[1]/ns0:Abstract[1]" w:storeItemID="{55AF091B-3C7A-41E3-B477-F2FDAA23CFDA}"/>
                                   <w:text/>
                                 </w:sdtPr>
+                                <w:sdtEndPr/>
                                 <w:sdtContent>
                                   <w:p>
                                     <w:pPr>
@@ -404,6 +407,7 @@
                                   <w:dataBinding w:prefixMappings="xmlns:ns0='http://schemas.openxmlformats.org/package/2006/metadata/core-properties' xmlns:ns1='http://purl.org/dc/elements/1.1/'" w:xpath="/ns0:coreProperties[1]/ns1:subject[1]" w:storeItemID="{6C3C8BC8-F283-45AE-878A-BAB7291924A1}"/>
                                   <w:text/>
                                 </w:sdtPr>
+                                <w:sdtEndPr/>
                                 <w:sdtContent>
                                   <w:p>
                                     <w:pPr>
@@ -457,18 +461,7 @@
                                         <w:szCs w:val="14"/>
                                         <w14:ligatures w14:val="none"/>
                                       </w:rPr>
-                                      <w:t>Tammy</w:t>
-                                    </w:r>
-                                    <w:r>
-                                      <w:rPr>
-                                        <w:rFonts w:ascii="Times New Roman" w:hAnsi="Times New Roman" w:cs="Times New Roman"/>
-                                        <w:color w:val="FFFFFF" w:themeColor="background1"/>
-                                        <w:kern w:val="0"/>
-                                        <w:sz w:val="14"/>
-                                        <w:szCs w:val="14"/>
-                                        <w14:ligatures w14:val="none"/>
-                                      </w:rPr>
-                                      <w:t xml:space="preserve"> Fourie 601264</w:t>
+                                      <w:t>Tammy Fourie 601264</w:t>
                                     </w:r>
                                   </w:p>
                                 </w:sdtContent>
@@ -620,7 +613,13 @@
     <w:sdt>
       <w:sdtPr>
         <w:rPr>
-          <w:lang w:val="en-GB"/>
+          <w:rFonts w:asciiTheme="minorHAnsi" w:eastAsiaTheme="minorHAnsi" w:hAnsiTheme="minorHAnsi" w:cstheme="minorBidi"/>
+          <w:color w:val="auto"/>
+          <w:kern w:val="2"/>
+          <w:sz w:val="24"/>
+          <w:szCs w:val="24"/>
+          <w:lang w:val="en-GB" w:eastAsia="en-US"/>
+          <w14:ligatures w14:val="standardContextual"/>
         </w:rPr>
         <w:id w:val="2064451552"/>
         <w:docPartObj>
@@ -630,15 +629,8 @@
       </w:sdtPr>
       <w:sdtEndPr>
         <w:rPr>
-          <w:rFonts w:asciiTheme="minorHAnsi" w:eastAsiaTheme="minorHAnsi" w:hAnsiTheme="minorHAnsi" w:cstheme="minorBidi"/>
           <w:b/>
           <w:bCs/>
-          <w:color w:val="auto"/>
-          <w:kern w:val="2"/>
-          <w:sz w:val="24"/>
-          <w:szCs w:val="24"/>
-          <w:lang w:eastAsia="en-US"/>
-          <w14:ligatures w14:val="standardContextual"/>
         </w:rPr>
       </w:sdtEndPr>
       <w:sdtContent>
@@ -1229,17 +1221,19 @@
         <w:tblLook w:val="04A0" w:firstRow="1" w:lastRow="0" w:firstColumn="1" w:lastColumn="0" w:noHBand="0" w:noVBand="1"/>
       </w:tblPr>
       <w:tblGrid>
-        <w:gridCol w:w="1502"/>
-        <w:gridCol w:w="1502"/>
-        <w:gridCol w:w="1503"/>
-        <w:gridCol w:w="1503"/>
-        <w:gridCol w:w="1503"/>
-        <w:gridCol w:w="1503"/>
+        <w:gridCol w:w="887"/>
+        <w:gridCol w:w="887"/>
+        <w:gridCol w:w="1200"/>
+        <w:gridCol w:w="1034"/>
+        <w:gridCol w:w="1195"/>
+        <w:gridCol w:w="1152"/>
+        <w:gridCol w:w="1430"/>
+        <w:gridCol w:w="1231"/>
       </w:tblGrid>
       <w:tr>
         <w:tc>
           <w:tcPr>
-            <w:tcW w:w="1502" w:type="dxa"/>
+            <w:tcW w:w="887" w:type="dxa"/>
             <w:shd w:val="clear" w:color="auto" w:fill="153D63" w:themeFill="text2" w:themeFillTint="E6"/>
           </w:tcPr>
           <w:p>
@@ -1256,13 +1250,13 @@
                 <w:sz w:val="20"/>
                 <w:szCs w:val="20"/>
               </w:rPr>
-              <w:t>Team member</w:t>
+              <w:t>ID</w:t>
             </w:r>
           </w:p>
         </w:tc>
         <w:tc>
           <w:tcPr>
-            <w:tcW w:w="1502" w:type="dxa"/>
+            <w:tcW w:w="887" w:type="dxa"/>
             <w:shd w:val="clear" w:color="auto" w:fill="153D63" w:themeFill="text2" w:themeFillTint="E6"/>
           </w:tcPr>
           <w:p>
@@ -1279,13 +1273,13 @@
                 <w:sz w:val="20"/>
                 <w:szCs w:val="20"/>
               </w:rPr>
-              <w:t>AI tool / use</w:t>
+              <w:t>Team member</w:t>
             </w:r>
           </w:p>
         </w:tc>
         <w:tc>
           <w:tcPr>
-            <w:tcW w:w="1503" w:type="dxa"/>
+            <w:tcW w:w="1200" w:type="dxa"/>
             <w:shd w:val="clear" w:color="auto" w:fill="153D63" w:themeFill="text2" w:themeFillTint="E6"/>
           </w:tcPr>
           <w:p>
@@ -1302,13 +1296,13 @@
                 <w:sz w:val="20"/>
                 <w:szCs w:val="20"/>
               </w:rPr>
-              <w:t>Purpose</w:t>
+              <w:t>Date</w:t>
             </w:r>
           </w:p>
         </w:tc>
         <w:tc>
           <w:tcPr>
-            <w:tcW w:w="1503" w:type="dxa"/>
+            <w:tcW w:w="1034" w:type="dxa"/>
             <w:shd w:val="clear" w:color="auto" w:fill="153D63" w:themeFill="text2" w:themeFillTint="E6"/>
           </w:tcPr>
           <w:p>
@@ -1325,13 +1319,13 @@
                 <w:sz w:val="20"/>
                 <w:szCs w:val="20"/>
               </w:rPr>
-              <w:t>Output used?</w:t>
+              <w:t>AI tool / use</w:t>
             </w:r>
           </w:p>
         </w:tc>
         <w:tc>
           <w:tcPr>
-            <w:tcW w:w="1503" w:type="dxa"/>
+            <w:tcW w:w="1195" w:type="dxa"/>
             <w:shd w:val="clear" w:color="auto" w:fill="153D63" w:themeFill="text2" w:themeFillTint="E6"/>
           </w:tcPr>
           <w:p>
@@ -1348,13 +1342,59 @@
                 <w:sz w:val="20"/>
                 <w:szCs w:val="20"/>
               </w:rPr>
-              <w:t>How independently verified?</w:t>
+              <w:t>Purpose</w:t>
             </w:r>
           </w:p>
         </w:tc>
         <w:tc>
           <w:tcPr>
-            <w:tcW w:w="1503" w:type="dxa"/>
+            <w:tcW w:w="1152" w:type="dxa"/>
+            <w:shd w:val="clear" w:color="auto" w:fill="153D63" w:themeFill="text2" w:themeFillTint="E6"/>
+          </w:tcPr>
+          <w:p>
+            <w:pPr>
+              <w:rPr>
+                <w:rFonts w:ascii="Times New Roman" w:hAnsi="Times New Roman" w:cs="Times New Roman"/>
+                <w:sz w:val="20"/>
+                <w:szCs w:val="20"/>
+              </w:rPr>
+            </w:pPr>
+            <w:r>
+              <w:rPr>
+                <w:rFonts w:ascii="Times New Roman" w:hAnsi="Times New Roman" w:cs="Times New Roman"/>
+                <w:sz w:val="20"/>
+                <w:szCs w:val="20"/>
+              </w:rPr>
+              <w:t>Output used?</w:t>
+            </w:r>
+          </w:p>
+        </w:tc>
+        <w:tc>
+          <w:tcPr>
+            <w:tcW w:w="1430" w:type="dxa"/>
+            <w:shd w:val="clear" w:color="auto" w:fill="153D63" w:themeFill="text2" w:themeFillTint="E6"/>
+          </w:tcPr>
+          <w:p>
+            <w:pPr>
+              <w:rPr>
+                <w:rFonts w:ascii="Times New Roman" w:hAnsi="Times New Roman" w:cs="Times New Roman"/>
+                <w:sz w:val="20"/>
+                <w:szCs w:val="20"/>
+              </w:rPr>
+            </w:pPr>
+            <w:r>
+              <w:rPr>
+                <w:rFonts w:ascii="Times New Roman" w:hAnsi="Times New Roman" w:cs="Times New Roman"/>
+                <w:sz w:val="20"/>
+                <w:szCs w:val="20"/>
+              </w:rPr>
+              <w:t>How independently verified?</w:t>
+            </w:r>
+          </w:p>
+        </w:tc>
+        <w:tc>
+          <w:tcPr>
+            <w:tcW w:w="1231" w:type="dxa"/>
             <w:shd w:val="clear" w:color="auto" w:fill="153D63" w:themeFill="text2" w:themeFillTint="E6"/>
           </w:tcPr>
           <w:p>
@@ -1379,37 +1419,49 @@
       <w:tr>
         <w:tc>
           <w:tcPr>
-            <w:tcW w:w="1502" w:type="dxa"/>
+            <w:tcW w:w="887" w:type="dxa"/>
           </w:tcPr>
           <w:p/>
         </w:tc>
         <w:tc>
           <w:tcPr>
-            <w:tcW w:w="1502" w:type="dxa"/>
+            <w:tcW w:w="887" w:type="dxa"/>
           </w:tcPr>
           <w:p/>
         </w:tc>
         <w:tc>
           <w:tcPr>
-            <w:tcW w:w="1503" w:type="dxa"/>
+            <w:tcW w:w="1200" w:type="dxa"/>
           </w:tcPr>
           <w:p/>
         </w:tc>
         <w:tc>
           <w:tcPr>
-            <w:tcW w:w="1503" w:type="dxa"/>
+            <w:tcW w:w="1034" w:type="dxa"/>
           </w:tcPr>
           <w:p/>
         </w:tc>
         <w:tc>
           <w:tcPr>
-            <w:tcW w:w="1503" w:type="dxa"/>
+            <w:tcW w:w="1195" w:type="dxa"/>
           </w:tcPr>
           <w:p/>
         </w:tc>
         <w:tc>
           <w:tcPr>
-            <w:tcW w:w="1503" w:type="dxa"/>
+            <w:tcW w:w="1152" w:type="dxa"/>
+          </w:tcPr>
+          <w:p/>
+        </w:tc>
+        <w:tc>
+          <w:tcPr>
+            <w:tcW w:w="1430" w:type="dxa"/>
+          </w:tcPr>
+          <w:p/>
+        </w:tc>
+        <w:tc>
+          <w:tcPr>
+            <w:tcW w:w="1231" w:type="dxa"/>
           </w:tcPr>
           <w:p/>
         </w:tc>
@@ -1417,37 +1469,49 @@
       <w:tr>
         <w:tc>
           <w:tcPr>
-            <w:tcW w:w="1502" w:type="dxa"/>
+            <w:tcW w:w="887" w:type="dxa"/>
           </w:tcPr>
           <w:p/>
         </w:tc>
         <w:tc>
           <w:tcPr>
-            <w:tcW w:w="1502" w:type="dxa"/>
+            <w:tcW w:w="887" w:type="dxa"/>
           </w:tcPr>
           <w:p/>
         </w:tc>
         <w:tc>
           <w:tcPr>
-            <w:tcW w:w="1503" w:type="dxa"/>
+            <w:tcW w:w="1200" w:type="dxa"/>
           </w:tcPr>
           <w:p/>
         </w:tc>
         <w:tc>
           <w:tcPr>
-            <w:tcW w:w="1503" w:type="dxa"/>
+            <w:tcW w:w="1034" w:type="dxa"/>
           </w:tcPr>
           <w:p/>
         </w:tc>
         <w:tc>
           <w:tcPr>
-            <w:tcW w:w="1503" w:type="dxa"/>
+            <w:tcW w:w="1195" w:type="dxa"/>
           </w:tcPr>
           <w:p/>
         </w:tc>
         <w:tc>
           <w:tcPr>
-            <w:tcW w:w="1503" w:type="dxa"/>
+            <w:tcW w:w="1152" w:type="dxa"/>
+          </w:tcPr>
+          <w:p/>
+        </w:tc>
+        <w:tc>
+          <w:tcPr>
+            <w:tcW w:w="1430" w:type="dxa"/>
+          </w:tcPr>
+          <w:p/>
+        </w:tc>
+        <w:tc>
+          <w:tcPr>
+            <w:tcW w:w="1231" w:type="dxa"/>
           </w:tcPr>
           <w:p/>
         </w:tc>
@@ -1474,6 +1538,10 @@
     <w:sdt>
       <w:sdtPr>
         <w:rPr>
+          <w:rFonts w:asciiTheme="minorHAnsi" w:eastAsiaTheme="minorHAnsi" w:hAnsiTheme="minorHAnsi" w:cstheme="minorBidi"/>
+          <w:color w:val="auto"/>
+          <w:sz w:val="24"/>
+          <w:szCs w:val="24"/>
           <w:lang w:val="en-GB"/>
         </w:rPr>
         <w:id w:val="1633681474"/>
@@ -1484,10 +1552,6 @@
       </w:sdtPr>
       <w:sdtEndPr>
         <w:rPr>
-          <w:rFonts w:asciiTheme="minorHAnsi" w:eastAsiaTheme="minorHAnsi" w:hAnsiTheme="minorHAnsi" w:cstheme="minorBidi"/>
-          <w:color w:val="auto"/>
-          <w:sz w:val="24"/>
-          <w:szCs w:val="24"/>
           <w:lang w:val="en-ZA"/>
         </w:rPr>
       </w:sdtEndPr>
@@ -1509,6 +1573,7 @@
             <w:id w:val="-573587230"/>
             <w:bibliography/>
           </w:sdtPr>
+          <w:sdtEndPr/>
           <w:sdtContent>
             <w:p>
               <w:r>
@@ -1590,6 +1655,7 @@
         <w:docPartUnique/>
       </w:docPartObj>
     </w:sdtPr>
+    <w:sdtEndPr/>
     <w:sdtContent>
       <w:p>
         <w:pPr>
@@ -2253,6 +2319,7 @@
   <w:style w:type="character" w:default="1" w:styleId="DefaultParagraphFont">
     <w:name w:val="Default Paragraph Font"/>
     <w:uiPriority w:val="1"/>
+    <w:semiHidden/>
     <w:unhideWhenUsed/>
   </w:style>
   <w:style w:type="table" w:default="1" w:styleId="TableNormal">

</xml_diff>

<commit_message>
Added numbering for headers
</commit_message>
<xml_diff>
--- a/assignment/SEN381 Assignment 3.docx
+++ b/assignment/SEN381 Assignment 3.docx
@@ -219,6 +219,7 @@
                             <w:dataBinding w:prefixMappings="xmlns:ns0='http://schemas.openxmlformats.org/package/2006/metadata/core-properties' xmlns:ns1='http://purl.org/dc/elements/1.1/'" w:xpath="/ns0:coreProperties[1]/ns1:title[1]" w:storeItemID="{6C3C8BC8-F283-45AE-878A-BAB7291924A1}"/>
                             <w:text/>
                           </w:sdtPr>
+                          <w:sdtEndPr/>
                           <w:sdtContent>
                             <w:p>
                               <w:pPr>
@@ -273,6 +274,7 @@
                             <w:dataBinding w:prefixMappings="xmlns:ns0='http://schemas.microsoft.com/office/2006/coverPageProps'" w:xpath="/ns0:CoverPageProperties[1]/ns0:Abstract[1]" w:storeItemID="{55AF091B-3C7A-41E3-B477-F2FDAA23CFDA}"/>
                             <w:text/>
                           </w:sdtPr>
+                          <w:sdtEndPr/>
                           <w:sdtContent>
                             <w:p>
                               <w:pPr>
@@ -515,6 +517,7 @@
                             <w:dataBinding w:prefixMappings="xmlns:ns0='http://schemas.openxmlformats.org/package/2006/metadata/core-properties' xmlns:ns1='http://purl.org/dc/elements/1.1/'" w:xpath="/ns0:coreProperties[1]/ns1:subject[1]" w:storeItemID="{6C3C8BC8-F283-45AE-878A-BAB7291924A1}"/>
                             <w:text/>
                           </w:sdtPr>
+                          <w:sdtEndPr/>
                           <w:sdtContent>
                             <w:p>
                               <w:pPr>
@@ -568,18 +571,7 @@
                                   <w:szCs w:val="14"/>
                                   <w14:ligatures w14:val="none"/>
                                 </w:rPr>
-                                <w:t>Tammy</w:t>
-                              </w:r>
-                              <w:r>
-                                <w:rPr>
-                                  <w:rFonts w:ascii="Times New Roman" w:hAnsi="Times New Roman" w:cs="Times New Roman"/>
-                                  <w:color w:val="FFFFFF" w:themeColor="background1"/>
-                                  <w:kern w:val="0"/>
-                                  <w:sz w:val="14"/>
-                                  <w:szCs w:val="14"/>
-                                  <w14:ligatures w14:val="none"/>
-                                </w:rPr>
-                                <w:t xml:space="preserve"> Fourie 601264</w:t>
+                                <w:t>Tammy Fourie 601264</w:t>
                               </w:r>
                             </w:p>
                           </w:sdtContent>
@@ -649,10 +641,13 @@
           <w:pPr>
             <w:pStyle w:val="TOC1"/>
             <w:tabs>
+              <w:tab w:val="left" w:pos="480"/>
               <w:tab w:val="right" w:leader="dot" w:pos="9016"/>
             </w:tabs>
             <w:rPr>
+              <w:rFonts w:eastAsiaTheme="minorEastAsia"/>
               <w:noProof/>
+              <w:lang w:eastAsia="en-ZA"/>
             </w:rPr>
           </w:pPr>
           <w:r>
@@ -664,24 +659,40 @@
           <w:r>
             <w:fldChar w:fldCharType="separate"/>
           </w:r>
-          <w:hyperlink w:anchor="_Toc240711037" w:history="1">
+          <w:hyperlink w:anchor="_Toc240715407" w:history="1">
             <w:r>
               <w:rPr>
                 <w:rStyle w:val="Hyperlink"/>
                 <w:rFonts w:ascii="Times New Roman" w:hAnsi="Times New Roman" w:cs="Times New Roman"/>
                 <w:noProof/>
               </w:rPr>
-              <w:t>Question 1 - Quality Strategy &amp; Risk-Based Verification</w:t>
-            </w:r>
-            <w:r>
-              <w:rPr>
-                <w:noProof/>
-                <w:webHidden/>
+              <w:t>1.</w:t>
+            </w:r>
+            <w:r>
+              <w:rPr>
+                <w:rFonts w:eastAsiaTheme="minorEastAsia"/>
+                <w:noProof/>
+                <w:lang w:eastAsia="en-ZA"/>
               </w:rPr>
               <w:tab/>
             </w:r>
             <w:r>
               <w:rPr>
+                <w:rStyle w:val="Hyperlink"/>
+                <w:rFonts w:ascii="Times New Roman" w:hAnsi="Times New Roman" w:cs="Times New Roman"/>
+                <w:noProof/>
+              </w:rPr>
+              <w:t>Quality Strategy &amp; Risk-Based Verification</w:t>
+            </w:r>
+            <w:r>
+              <w:rPr>
+                <w:noProof/>
+                <w:webHidden/>
+              </w:rPr>
+              <w:tab/>
+            </w:r>
+            <w:r>
+              <w:rPr>
                 <w:noProof/>
                 <w:webHidden/>
               </w:rPr>
@@ -692,7 +703,7 @@
                 <w:noProof/>
                 <w:webHidden/>
               </w:rPr>
-              <w:instrText xml:space="preserve"> PAGEREF _Toc240711037 \h </w:instrText>
+              <w:instrText xml:space="preserve"> PAGEREF _Toc240715407 \h </w:instrText>
             </w:r>
             <w:r>
               <w:rPr>
@@ -713,6 +724,270 @@
                 <w:webHidden/>
               </w:rPr>
               <w:t>2</w:t>
+            </w:r>
+            <w:r>
+              <w:rPr>
+                <w:noProof/>
+                <w:webHidden/>
+              </w:rPr>
+              <w:fldChar w:fldCharType="end"/>
+            </w:r>
+          </w:hyperlink>
+        </w:p>
+        <w:p>
+          <w:pPr>
+            <w:pStyle w:val="TOC1"/>
+            <w:tabs>
+              <w:tab w:val="left" w:pos="480"/>
+              <w:tab w:val="right" w:leader="dot" w:pos="9016"/>
+            </w:tabs>
+            <w:rPr>
+              <w:rFonts w:eastAsiaTheme="minorEastAsia"/>
+              <w:noProof/>
+              <w:lang w:eastAsia="en-ZA"/>
+            </w:rPr>
+          </w:pPr>
+          <w:hyperlink w:anchor="_Toc240715408" w:history="1">
+            <w:r>
+              <w:rPr>
+                <w:rStyle w:val="Hyperlink"/>
+                <w:rFonts w:ascii="Times New Roman" w:hAnsi="Times New Roman" w:cs="Times New Roman"/>
+                <w:noProof/>
+              </w:rPr>
+              <w:t>2.</w:t>
+            </w:r>
+            <w:r>
+              <w:rPr>
+                <w:rFonts w:eastAsiaTheme="minorEastAsia"/>
+                <w:noProof/>
+                <w:lang w:eastAsia="en-ZA"/>
+              </w:rPr>
+              <w:tab/>
+            </w:r>
+            <w:r>
+              <w:rPr>
+                <w:rStyle w:val="Hyperlink"/>
+                <w:rFonts w:ascii="Times New Roman" w:hAnsi="Times New Roman" w:cs="Times New Roman"/>
+                <w:noProof/>
+              </w:rPr>
+              <w:t>Security Engineering &amp; Threat-Based Controls</w:t>
+            </w:r>
+            <w:r>
+              <w:rPr>
+                <w:noProof/>
+                <w:webHidden/>
+              </w:rPr>
+              <w:tab/>
+            </w:r>
+            <w:r>
+              <w:rPr>
+                <w:noProof/>
+                <w:webHidden/>
+              </w:rPr>
+              <w:fldChar w:fldCharType="begin"/>
+            </w:r>
+            <w:r>
+              <w:rPr>
+                <w:noProof/>
+                <w:webHidden/>
+              </w:rPr>
+              <w:instrText xml:space="preserve"> PAGEREF _Toc240715408 \h </w:instrText>
+            </w:r>
+            <w:r>
+              <w:rPr>
+                <w:noProof/>
+                <w:webHidden/>
+              </w:rPr>
+            </w:r>
+            <w:r>
+              <w:rPr>
+                <w:noProof/>
+                <w:webHidden/>
+              </w:rPr>
+              <w:fldChar w:fldCharType="separate"/>
+            </w:r>
+            <w:r>
+              <w:rPr>
+                <w:noProof/>
+                <w:webHidden/>
+              </w:rPr>
+              <w:t>3</w:t>
+            </w:r>
+            <w:r>
+              <w:rPr>
+                <w:noProof/>
+                <w:webHidden/>
+              </w:rPr>
+              <w:fldChar w:fldCharType="end"/>
+            </w:r>
+          </w:hyperlink>
+        </w:p>
+        <w:p>
+          <w:pPr>
+            <w:pStyle w:val="TOC1"/>
+            <w:tabs>
+              <w:tab w:val="left" w:pos="480"/>
+              <w:tab w:val="right" w:leader="dot" w:pos="9016"/>
+            </w:tabs>
+            <w:rPr>
+              <w:rFonts w:eastAsiaTheme="minorEastAsia"/>
+              <w:noProof/>
+              <w:lang w:eastAsia="en-ZA"/>
+            </w:rPr>
+          </w:pPr>
+          <w:hyperlink w:anchor="_Toc240715409" w:history="1">
+            <w:r>
+              <w:rPr>
+                <w:rStyle w:val="Hyperlink"/>
+                <w:rFonts w:ascii="Times New Roman" w:hAnsi="Times New Roman" w:cs="Times New Roman"/>
+                <w:noProof/>
+              </w:rPr>
+              <w:t>3.</w:t>
+            </w:r>
+            <w:r>
+              <w:rPr>
+                <w:rFonts w:eastAsiaTheme="minorEastAsia"/>
+                <w:noProof/>
+                <w:lang w:eastAsia="en-ZA"/>
+              </w:rPr>
+              <w:tab/>
+            </w:r>
+            <w:r>
+              <w:rPr>
+                <w:rStyle w:val="Hyperlink"/>
+                <w:rFonts w:ascii="Times New Roman" w:hAnsi="Times New Roman" w:cs="Times New Roman"/>
+                <w:noProof/>
+              </w:rPr>
+              <w:t>Production Readiness, Deployment &amp; Operational Evidence</w:t>
+            </w:r>
+            <w:r>
+              <w:rPr>
+                <w:noProof/>
+                <w:webHidden/>
+              </w:rPr>
+              <w:tab/>
+            </w:r>
+            <w:r>
+              <w:rPr>
+                <w:noProof/>
+                <w:webHidden/>
+              </w:rPr>
+              <w:fldChar w:fldCharType="begin"/>
+            </w:r>
+            <w:r>
+              <w:rPr>
+                <w:noProof/>
+                <w:webHidden/>
+              </w:rPr>
+              <w:instrText xml:space="preserve"> PAGEREF _Toc240715409 \h </w:instrText>
+            </w:r>
+            <w:r>
+              <w:rPr>
+                <w:noProof/>
+                <w:webHidden/>
+              </w:rPr>
+            </w:r>
+            <w:r>
+              <w:rPr>
+                <w:noProof/>
+                <w:webHidden/>
+              </w:rPr>
+              <w:fldChar w:fldCharType="separate"/>
+            </w:r>
+            <w:r>
+              <w:rPr>
+                <w:noProof/>
+                <w:webHidden/>
+              </w:rPr>
+              <w:t>4</w:t>
+            </w:r>
+            <w:r>
+              <w:rPr>
+                <w:noProof/>
+                <w:webHidden/>
+              </w:rPr>
+              <w:fldChar w:fldCharType="end"/>
+            </w:r>
+          </w:hyperlink>
+        </w:p>
+        <w:p>
+          <w:pPr>
+            <w:pStyle w:val="TOC1"/>
+            <w:tabs>
+              <w:tab w:val="left" w:pos="480"/>
+              <w:tab w:val="right" w:leader="dot" w:pos="9016"/>
+            </w:tabs>
+            <w:rPr>
+              <w:rFonts w:eastAsiaTheme="minorEastAsia"/>
+              <w:noProof/>
+              <w:lang w:eastAsia="en-ZA"/>
+            </w:rPr>
+          </w:pPr>
+          <w:hyperlink w:anchor="_Toc240715410" w:history="1">
+            <w:r>
+              <w:rPr>
+                <w:rStyle w:val="Hyperlink"/>
+                <w:rFonts w:ascii="Times New Roman" w:hAnsi="Times New Roman" w:cs="Times New Roman"/>
+                <w:noProof/>
+              </w:rPr>
+              <w:t>4.</w:t>
+            </w:r>
+            <w:r>
+              <w:rPr>
+                <w:rFonts w:eastAsiaTheme="minorEastAsia"/>
+                <w:noProof/>
+                <w:lang w:eastAsia="en-ZA"/>
+              </w:rPr>
+              <w:tab/>
+            </w:r>
+            <w:r>
+              <w:rPr>
+                <w:rStyle w:val="Hyperlink"/>
+                <w:rFonts w:ascii="Times New Roman" w:hAnsi="Times New Roman" w:cs="Times New Roman"/>
+                <w:noProof/>
+              </w:rPr>
+              <w:t>Research-to-M3 Engineering Map</w:t>
+            </w:r>
+            <w:r>
+              <w:rPr>
+                <w:noProof/>
+                <w:webHidden/>
+              </w:rPr>
+              <w:tab/>
+            </w:r>
+            <w:r>
+              <w:rPr>
+                <w:noProof/>
+                <w:webHidden/>
+              </w:rPr>
+              <w:fldChar w:fldCharType="begin"/>
+            </w:r>
+            <w:r>
+              <w:rPr>
+                <w:noProof/>
+                <w:webHidden/>
+              </w:rPr>
+              <w:instrText xml:space="preserve"> PAGEREF _Toc240715410 \h </w:instrText>
+            </w:r>
+            <w:r>
+              <w:rPr>
+                <w:noProof/>
+                <w:webHidden/>
+              </w:rPr>
+            </w:r>
+            <w:r>
+              <w:rPr>
+                <w:noProof/>
+                <w:webHidden/>
+              </w:rPr>
+              <w:fldChar w:fldCharType="separate"/>
+            </w:r>
+            <w:r>
+              <w:rPr>
+                <w:noProof/>
+                <w:webHidden/>
+              </w:rPr>
+              <w:t>5</w:t>
             </w:r>
             <w:r>
               <w:rPr>
@@ -730,17 +1005,19 @@
               <w:tab w:val="right" w:leader="dot" w:pos="9016"/>
             </w:tabs>
             <w:rPr>
+              <w:rFonts w:eastAsiaTheme="minorEastAsia"/>
               <w:noProof/>
+              <w:lang w:eastAsia="en-ZA"/>
             </w:rPr>
           </w:pPr>
-          <w:hyperlink w:anchor="_Toc240711038" w:history="1">
+          <w:hyperlink w:anchor="_Toc240715411" w:history="1">
             <w:r>
               <w:rPr>
                 <w:rStyle w:val="Hyperlink"/>
                 <w:rFonts w:ascii="Times New Roman" w:hAnsi="Times New Roman" w:cs="Times New Roman"/>
                 <w:noProof/>
               </w:rPr>
-              <w:t>Question 2 - Security Engineering &amp; Threat-Based Controls</w:t>
+              <w:t>AI Research &amp; Verification Record</w:t>
             </w:r>
             <w:r>
               <w:rPr>
@@ -761,7 +1038,7 @@
                 <w:noProof/>
                 <w:webHidden/>
               </w:rPr>
-              <w:instrText xml:space="preserve"> PAGEREF _Toc240711038 \h </w:instrText>
+              <w:instrText xml:space="preserve"> PAGEREF _Toc240715411 \h </w:instrText>
             </w:r>
             <w:r>
               <w:rPr>
@@ -781,7 +1058,7 @@
                 <w:noProof/>
                 <w:webHidden/>
               </w:rPr>
-              <w:t>3</w:t>
+              <w:t>6</w:t>
             </w:r>
             <w:r>
               <w:rPr>
@@ -799,17 +1076,19 @@
               <w:tab w:val="right" w:leader="dot" w:pos="9016"/>
             </w:tabs>
             <w:rPr>
+              <w:rFonts w:eastAsiaTheme="minorEastAsia"/>
               <w:noProof/>
+              <w:lang w:eastAsia="en-ZA"/>
             </w:rPr>
           </w:pPr>
-          <w:hyperlink w:anchor="_Toc240711039" w:history="1">
+          <w:hyperlink w:anchor="_Toc240715412" w:history="1">
             <w:r>
               <w:rPr>
                 <w:rStyle w:val="Hyperlink"/>
-                <w:rFonts w:ascii="Times New Roman" w:hAnsi="Times New Roman" w:cs="Times New Roman"/>
-                <w:noProof/>
-              </w:rPr>
-              <w:t>Question 3 - Production Readiness, Deployment &amp; Operational Evidence</w:t>
+                <w:noProof/>
+                <w:lang w:val="en-GB"/>
+              </w:rPr>
+              <w:t>References</w:t>
             </w:r>
             <w:r>
               <w:rPr>
@@ -830,214 +1109,7 @@
                 <w:noProof/>
                 <w:webHidden/>
               </w:rPr>
-              <w:instrText xml:space="preserve"> PAGEREF _Toc240711039 \h </w:instrText>
-            </w:r>
-            <w:r>
-              <w:rPr>
-                <w:noProof/>
-                <w:webHidden/>
-              </w:rPr>
-            </w:r>
-            <w:r>
-              <w:rPr>
-                <w:noProof/>
-                <w:webHidden/>
-              </w:rPr>
-              <w:fldChar w:fldCharType="separate"/>
-            </w:r>
-            <w:r>
-              <w:rPr>
-                <w:noProof/>
-                <w:webHidden/>
-              </w:rPr>
-              <w:t>4</w:t>
-            </w:r>
-            <w:r>
-              <w:rPr>
-                <w:noProof/>
-                <w:webHidden/>
-              </w:rPr>
-              <w:fldChar w:fldCharType="end"/>
-            </w:r>
-          </w:hyperlink>
-        </w:p>
-        <w:p>
-          <w:pPr>
-            <w:pStyle w:val="TOC1"/>
-            <w:tabs>
-              <w:tab w:val="right" w:leader="dot" w:pos="9016"/>
-            </w:tabs>
-            <w:rPr>
-              <w:noProof/>
-            </w:rPr>
-          </w:pPr>
-          <w:hyperlink w:anchor="_Toc240711040" w:history="1">
-            <w:r>
-              <w:rPr>
-                <w:rStyle w:val="Hyperlink"/>
-                <w:rFonts w:ascii="Times New Roman" w:hAnsi="Times New Roman" w:cs="Times New Roman"/>
-                <w:noProof/>
-              </w:rPr>
-              <w:t>Question 4 - Research-to-M3 Engineering Map</w:t>
-            </w:r>
-            <w:r>
-              <w:rPr>
-                <w:noProof/>
-                <w:webHidden/>
-              </w:rPr>
-              <w:tab/>
-            </w:r>
-            <w:r>
-              <w:rPr>
-                <w:noProof/>
-                <w:webHidden/>
-              </w:rPr>
-              <w:fldChar w:fldCharType="begin"/>
-            </w:r>
-            <w:r>
-              <w:rPr>
-                <w:noProof/>
-                <w:webHidden/>
-              </w:rPr>
-              <w:instrText xml:space="preserve"> PAGEREF _Toc240711040 \h </w:instrText>
-            </w:r>
-            <w:r>
-              <w:rPr>
-                <w:noProof/>
-                <w:webHidden/>
-              </w:rPr>
-            </w:r>
-            <w:r>
-              <w:rPr>
-                <w:noProof/>
-                <w:webHidden/>
-              </w:rPr>
-              <w:fldChar w:fldCharType="separate"/>
-            </w:r>
-            <w:r>
-              <w:rPr>
-                <w:noProof/>
-                <w:webHidden/>
-              </w:rPr>
-              <w:t>5</w:t>
-            </w:r>
-            <w:r>
-              <w:rPr>
-                <w:noProof/>
-                <w:webHidden/>
-              </w:rPr>
-              <w:fldChar w:fldCharType="end"/>
-            </w:r>
-          </w:hyperlink>
-        </w:p>
-        <w:p>
-          <w:pPr>
-            <w:pStyle w:val="TOC1"/>
-            <w:tabs>
-              <w:tab w:val="right" w:leader="dot" w:pos="9016"/>
-            </w:tabs>
-            <w:rPr>
-              <w:noProof/>
-            </w:rPr>
-          </w:pPr>
-          <w:hyperlink w:anchor="_Toc240711041" w:history="1">
-            <w:r>
-              <w:rPr>
-                <w:rStyle w:val="Hyperlink"/>
-                <w:rFonts w:ascii="Times New Roman" w:hAnsi="Times New Roman" w:cs="Times New Roman"/>
-                <w:noProof/>
-              </w:rPr>
-              <w:t>AI Research &amp; Verification Record</w:t>
-            </w:r>
-            <w:r>
-              <w:rPr>
-                <w:noProof/>
-                <w:webHidden/>
-              </w:rPr>
-              <w:tab/>
-            </w:r>
-            <w:r>
-              <w:rPr>
-                <w:noProof/>
-                <w:webHidden/>
-              </w:rPr>
-              <w:fldChar w:fldCharType="begin"/>
-            </w:r>
-            <w:r>
-              <w:rPr>
-                <w:noProof/>
-                <w:webHidden/>
-              </w:rPr>
-              <w:instrText xml:space="preserve"> PAGEREF _Toc240711041 \h </w:instrText>
-            </w:r>
-            <w:r>
-              <w:rPr>
-                <w:noProof/>
-                <w:webHidden/>
-              </w:rPr>
-            </w:r>
-            <w:r>
-              <w:rPr>
-                <w:noProof/>
-                <w:webHidden/>
-              </w:rPr>
-              <w:fldChar w:fldCharType="separate"/>
-            </w:r>
-            <w:r>
-              <w:rPr>
-                <w:noProof/>
-                <w:webHidden/>
-              </w:rPr>
-              <w:t>6</w:t>
-            </w:r>
-            <w:r>
-              <w:rPr>
-                <w:noProof/>
-                <w:webHidden/>
-              </w:rPr>
-              <w:fldChar w:fldCharType="end"/>
-            </w:r>
-          </w:hyperlink>
-        </w:p>
-        <w:p>
-          <w:pPr>
-            <w:pStyle w:val="TOC1"/>
-            <w:tabs>
-              <w:tab w:val="right" w:leader="dot" w:pos="9016"/>
-            </w:tabs>
-            <w:rPr>
-              <w:noProof/>
-            </w:rPr>
-          </w:pPr>
-          <w:hyperlink w:anchor="_Toc240711042" w:history="1">
-            <w:r>
-              <w:rPr>
-                <w:rStyle w:val="Hyperlink"/>
-                <w:noProof/>
-                <w:lang w:val="en-GB"/>
-              </w:rPr>
-              <w:t>References</w:t>
-            </w:r>
-            <w:r>
-              <w:rPr>
-                <w:noProof/>
-                <w:webHidden/>
-              </w:rPr>
-              <w:tab/>
-            </w:r>
-            <w:r>
-              <w:rPr>
-                <w:noProof/>
-                <w:webHidden/>
-              </w:rPr>
-              <w:fldChar w:fldCharType="begin"/>
-            </w:r>
-            <w:r>
-              <w:rPr>
-                <w:noProof/>
-                <w:webHidden/>
-              </w:rPr>
-              <w:instrText xml:space="preserve"> PAGEREF _Toc240711042 \h </w:instrText>
+              <w:instrText xml:space="preserve"> PAGEREF _Toc240715412 \h </w:instrText>
             </w:r>
             <w:r>
               <w:rPr>
@@ -1089,17 +1161,21 @@
     <w:p>
       <w:pPr>
         <w:pStyle w:val="Heading1"/>
+        <w:numPr>
+          <w:ilvl w:val="0"/>
+          <w:numId w:val="1"/>
+        </w:numPr>
         <w:rPr>
           <w:rFonts w:ascii="Times New Roman" w:hAnsi="Times New Roman" w:cs="Times New Roman"/>
         </w:rPr>
       </w:pPr>
-      <w:bookmarkStart w:id="0" w:name="_Toc240711037"/>
+      <w:bookmarkStart w:id="0" w:name="_Toc240715407"/>
       <w:r>
         <w:rPr>
           <w:rFonts w:ascii="Times New Roman" w:hAnsi="Times New Roman" w:cs="Times New Roman"/>
         </w:rPr>
         <w:lastRenderedPageBreak/>
-        <w:t>Question 1 - Quality Strategy &amp; Risk-Based Verification</w:t>
+        <w:t>Quality Strategy &amp; Risk-Based Verification</w:t>
       </w:r>
       <w:bookmarkEnd w:id="0"/>
     </w:p>
@@ -1112,17 +1188,21 @@
     <w:p>
       <w:pPr>
         <w:pStyle w:val="Heading1"/>
+        <w:numPr>
+          <w:ilvl w:val="0"/>
+          <w:numId w:val="1"/>
+        </w:numPr>
         <w:rPr>
           <w:rFonts w:ascii="Times New Roman" w:hAnsi="Times New Roman" w:cs="Times New Roman"/>
         </w:rPr>
       </w:pPr>
-      <w:bookmarkStart w:id="1" w:name="_Toc240711038"/>
+      <w:bookmarkStart w:id="1" w:name="_Toc240715408"/>
       <w:r>
         <w:rPr>
           <w:rFonts w:ascii="Times New Roman" w:hAnsi="Times New Roman" w:cs="Times New Roman"/>
         </w:rPr>
         <w:lastRenderedPageBreak/>
-        <w:t>Question 2 - Security Engineering &amp; Threat-Based Controls</w:t>
+        <w:t>Security Engineering &amp; Threat-Based Controls</w:t>
       </w:r>
       <w:bookmarkEnd w:id="1"/>
     </w:p>
@@ -1134,17 +1214,21 @@
     <w:p>
       <w:pPr>
         <w:pStyle w:val="Heading1"/>
+        <w:numPr>
+          <w:ilvl w:val="0"/>
+          <w:numId w:val="1"/>
+        </w:numPr>
         <w:rPr>
           <w:rFonts w:ascii="Times New Roman" w:hAnsi="Times New Roman" w:cs="Times New Roman"/>
         </w:rPr>
       </w:pPr>
-      <w:bookmarkStart w:id="2" w:name="_Toc240711039"/>
+      <w:bookmarkStart w:id="2" w:name="_Toc240715409"/>
       <w:r>
         <w:rPr>
           <w:rFonts w:ascii="Times New Roman" w:hAnsi="Times New Roman" w:cs="Times New Roman"/>
         </w:rPr>
         <w:lastRenderedPageBreak/>
-        <w:t>Question 3 - Production Readiness, Deployment &amp; Operational Evidence</w:t>
+        <w:t>Production Readiness, Deployment &amp; Operational Evidence</w:t>
       </w:r>
       <w:bookmarkEnd w:id="2"/>
     </w:p>
@@ -1167,17 +1251,21 @@
     <w:p>
       <w:pPr>
         <w:pStyle w:val="Heading1"/>
+        <w:numPr>
+          <w:ilvl w:val="0"/>
+          <w:numId w:val="1"/>
+        </w:numPr>
         <w:rPr>
           <w:rFonts w:ascii="Times New Roman" w:hAnsi="Times New Roman" w:cs="Times New Roman"/>
         </w:rPr>
       </w:pPr>
-      <w:bookmarkStart w:id="3" w:name="_Toc240711040"/>
+      <w:bookmarkStart w:id="3" w:name="_Toc240715410"/>
       <w:r>
         <w:rPr>
           <w:rFonts w:ascii="Times New Roman" w:hAnsi="Times New Roman" w:cs="Times New Roman"/>
         </w:rPr>
         <w:lastRenderedPageBreak/>
-        <w:t>Question 4 - Research-to-M3 Engineering Map</w:t>
+        <w:t>Research-to-M3 Engineering Map</w:t>
       </w:r>
       <w:bookmarkEnd w:id="3"/>
     </w:p>
@@ -1204,7 +1292,7 @@
           <w:rFonts w:ascii="Times New Roman" w:hAnsi="Times New Roman" w:cs="Times New Roman"/>
         </w:rPr>
       </w:pPr>
-      <w:bookmarkStart w:id="4" w:name="_Toc240711041"/>
+      <w:bookmarkStart w:id="4" w:name="_Toc240715411"/>
       <w:r>
         <w:rPr>
           <w:rFonts w:ascii="Times New Roman" w:hAnsi="Times New Roman" w:cs="Times New Roman"/>
@@ -1534,7 +1622,7 @@
         <w:br w:type="page"/>
       </w:r>
     </w:p>
-    <w:bookmarkStart w:id="5" w:name="_Toc240711042" w:displacedByCustomXml="next"/>
+    <w:bookmarkStart w:id="5" w:name="_Toc240715412" w:displacedByCustomXml="next"/>
     <w:sdt>
       <w:sdtPr>
         <w:rPr>
@@ -1608,7 +1696,7 @@
     </w:sdt>
     <w:p/>
     <w:sectPr>
-      <w:footerReference w:type="default" r:id="rId8"/>
+      <w:footerReference w:type="default" r:id="rId9"/>
       <w:pgSz w:w="11906" w:h="16838"/>
       <w:pgMar w:top="1440" w:right="1440" w:bottom="1440" w:left="1440" w:header="708" w:footer="708" w:gutter="0"/>
       <w:pgNumType w:start="0"/>
@@ -1714,6 +1802,100 @@
     </w:p>
   </w:footnote>
 </w:footnotes>
+</file>
+
+<file path=word/numbering.xml><?xml version="1.0" encoding="utf-8"?>
+<w:numbering xmlns:wpc="http://schemas.microsoft.com/office/word/2010/wordprocessingCanvas" xmlns:cx="http://schemas.microsoft.com/office/drawing/2014/chartex" xmlns:cx1="http://schemas.microsoft.com/office/drawing/2015/9/8/chartex" xmlns:cx2="http://schemas.microsoft.com/office/drawing/2015/10/21/chartex" xmlns:cx3="http://schemas.microsoft.com/office/drawing/2016/5/9/chartex" xmlns:cx4="http://schemas.microsoft.com/office/drawing/2016/5/10/chartex" xmlns:cx5="http://schemas.microsoft.com/office/drawing/2016/5/11/chartex" xmlns:cx6="http://schemas.microsoft.com/office/drawing/2016/5/12/chartex" xmlns:cx7="http://schemas.microsoft.com/office/drawing/2016/5/13/chartex" xmlns:cx8="http://schemas.microsoft.com/office/drawing/2016/5/14/chartex" xmlns:mc="http://schemas.openxmlformats.org/markup-compatibility/2006" xmlns:aink="http://schemas.microsoft.com/office/drawing/2016/ink" xmlns:am3d="http://schemas.microsoft.com/office/drawing/2017/model3d" xmlns:o="urn:schemas-microsoft-com:office:office" xmlns:oel="http://schemas.microsoft.com/office/2019/extlst" xmlns:r="http://schemas.openxmlformats.org/officeDocument/2006/relationships" xmlns:m="http://schemas.openxmlformats.org/officeDocument/2006/math" xmlns:v="urn:schemas-microsoft-com:vml" xmlns:wp14="http://schemas.microsoft.com/office/word/2010/wordprocessingDrawing" xmlns:wp="http://schemas.openxmlformats.org/drawingml/2006/wordprocessingDrawing" xmlns:w10="urn:schemas-microsoft-com:office:word" xmlns:w="http://schemas.openxmlformats.org/wordprocessingml/2006/main" xmlns:w14="http://schemas.microsoft.com/office/word/2010/wordml" xmlns:w15="http://schemas.microsoft.com/office/word/2012/wordml" xmlns:w16cex="http://schemas.microsoft.com/office/word/2018/wordml/cex" xmlns:w16cid="http://schemas.microsoft.com/office/word/2016/wordml/cid" xmlns:w16="http://schemas.microsoft.com/office/word/2018/wordml" xmlns:w16du="http://schemas.microsoft.com/office/word/2023/wordml/word16du" xmlns:w16sdtdh="http://schemas.microsoft.com/office/word/2020/wordml/sdtdatahash" xmlns:w16sdtfl="http://schemas.microsoft.com/office/word/2024/wordml/sdtformatlock" xmlns:w16se="http://schemas.microsoft.com/office/word/2015/wordml/symex" xmlns:wpg="http://schemas.microsoft.com/office/word/2010/wordprocessingGroup" xmlns:wpi="http://schemas.microsoft.com/office/word/2010/wordprocessingInk" xmlns:wne="http://schemas.microsoft.com/office/word/2006/wordml" xmlns:wps="http://schemas.microsoft.com/office/word/2010/wordprocessingShape" mc:Ignorable="w14 w15 w16se w16cid w16 w16cex w16sdtdh w16sdtfl w16du wp14">
+  <w:abstractNum w:abstractNumId="0" w15:restartNumberingAfterBreak="0">
+    <w:nsid w:val="73B069D5"/>
+    <w:multiLevelType w:val="multilevel"/>
+    <w:tmpl w:val="1C09001F"/>
+    <w:lvl w:ilvl="0">
+      <w:start w:val="1"/>
+      <w:numFmt w:val="decimal"/>
+      <w:lvlText w:val="%1."/>
+      <w:lvlJc w:val="left"/>
+      <w:pPr>
+        <w:ind w:left="360" w:hanging="360"/>
+      </w:pPr>
+    </w:lvl>
+    <w:lvl w:ilvl="1">
+      <w:start w:val="1"/>
+      <w:numFmt w:val="decimal"/>
+      <w:lvlText w:val="%1.%2."/>
+      <w:lvlJc w:val="left"/>
+      <w:pPr>
+        <w:ind w:left="792" w:hanging="432"/>
+      </w:pPr>
+    </w:lvl>
+    <w:lvl w:ilvl="2">
+      <w:start w:val="1"/>
+      <w:numFmt w:val="decimal"/>
+      <w:lvlText w:val="%1.%2.%3."/>
+      <w:lvlJc w:val="left"/>
+      <w:pPr>
+        <w:ind w:left="1224" w:hanging="504"/>
+      </w:pPr>
+    </w:lvl>
+    <w:lvl w:ilvl="3">
+      <w:start w:val="1"/>
+      <w:numFmt w:val="decimal"/>
+      <w:lvlText w:val="%1.%2.%3.%4."/>
+      <w:lvlJc w:val="left"/>
+      <w:pPr>
+        <w:ind w:left="1728" w:hanging="648"/>
+      </w:pPr>
+    </w:lvl>
+    <w:lvl w:ilvl="4">
+      <w:start w:val="1"/>
+      <w:numFmt w:val="decimal"/>
+      <w:lvlText w:val="%1.%2.%3.%4.%5."/>
+      <w:lvlJc w:val="left"/>
+      <w:pPr>
+        <w:ind w:left="2232" w:hanging="792"/>
+      </w:pPr>
+    </w:lvl>
+    <w:lvl w:ilvl="5">
+      <w:start w:val="1"/>
+      <w:numFmt w:val="decimal"/>
+      <w:lvlText w:val="%1.%2.%3.%4.%5.%6."/>
+      <w:lvlJc w:val="left"/>
+      <w:pPr>
+        <w:ind w:left="2736" w:hanging="936"/>
+      </w:pPr>
+    </w:lvl>
+    <w:lvl w:ilvl="6">
+      <w:start w:val="1"/>
+      <w:numFmt w:val="decimal"/>
+      <w:lvlText w:val="%1.%2.%3.%4.%5.%6.%7."/>
+      <w:lvlJc w:val="left"/>
+      <w:pPr>
+        <w:ind w:left="3240" w:hanging="1080"/>
+      </w:pPr>
+    </w:lvl>
+    <w:lvl w:ilvl="7">
+      <w:start w:val="1"/>
+      <w:numFmt w:val="decimal"/>
+      <w:lvlText w:val="%1.%2.%3.%4.%5.%6.%7.%8."/>
+      <w:lvlJc w:val="left"/>
+      <w:pPr>
+        <w:ind w:left="3744" w:hanging="1224"/>
+      </w:pPr>
+    </w:lvl>
+    <w:lvl w:ilvl="8">
+      <w:start w:val="1"/>
+      <w:numFmt w:val="decimal"/>
+      <w:lvlText w:val="%1.%2.%3.%4.%5.%6.%7.%8.%9."/>
+      <w:lvlJc w:val="left"/>
+      <w:pPr>
+        <w:ind w:left="4320" w:hanging="1440"/>
+      </w:pPr>
+    </w:lvl>
+  </w:abstractNum>
+  <w:num w:numId="1" w16cid:durableId="1721440717">
+    <w:abstractNumId w:val="0"/>
+  </w:num>
+</w:numbering>
 </file>
 
 <file path=word/styles.xml><?xml version="1.0" encoding="utf-8"?>

</xml_diff>